<commit_message>
test(studio): capture final proposal UX and immutable document evidence
</commit_message>
<xml_diff>
--- a/docs/qa/commercial-docs-01c/regressions/repair-protocol/official-synthetic.docx
+++ b/docs/qa/commercial-docs-01c/regressions/repair-protocol/official-synthetic.docx
@@ -2466,7 +2466,7 @@
                 <w:color w:val="000000"/>
                 <w:sz w:val="18"/>
               </w:rPr>
-              <w:t>23.10.2026 08:05</w:t>
+              <w:t>23.10.2026 08:36</w:t>
             </w:r>
           </w:p>
         </w:tc>
@@ -2538,7 +2538,7 @@
                 <w:color w:val="000000"/>
                 <w:sz w:val="18"/>
               </w:rPr>
-              <w:t>23.10.2026 08:05</w:t>
+              <w:t>23.10.2026 08:36</w:t>
             </w:r>
           </w:p>
         </w:tc>
@@ -3182,7 +3182,7 @@
                 <w:color w:val="000000"/>
                 <w:sz w:val="17"/>
               </w:rPr>
-              <w:t>23.10.2026 08:05</w:t>
+              <w:t>23.10.2026 08:36</w:t>
             </w:r>
           </w:p>
         </w:tc>
@@ -3256,7 +3256,7 @@
                 <w:color w:val="000000"/>
                 <w:sz w:val="17"/>
               </w:rPr>
-              <w:t>23.10.2026 08:05</w:t>
+              <w:t>23.10.2026 08:36</w:t>
             </w:r>
           </w:p>
         </w:tc>
@@ -3330,7 +3330,7 @@
                 <w:color w:val="000000"/>
                 <w:sz w:val="17"/>
               </w:rPr>
-              <w:t>23.10.2026 08:05</w:t>
+              <w:t>23.10.2026 08:36</w:t>
             </w:r>
           </w:p>
         </w:tc>
@@ -3404,7 +3404,7 @@
                 <w:color w:val="000000"/>
                 <w:sz w:val="17"/>
               </w:rPr>
-              <w:t>23.10.2026 08:05</w:t>
+              <w:t>23.10.2026 08:36</w:t>
             </w:r>
           </w:p>
         </w:tc>
@@ -3478,7 +3478,7 @@
                 <w:color w:val="000000"/>
                 <w:sz w:val="17"/>
               </w:rPr>
-              <w:t>23.10.2026 08:05</w:t>
+              <w:t>23.10.2026 08:36</w:t>
             </w:r>
           </w:p>
         </w:tc>

</xml_diff>